<commit_message>
Use the public CV on the site
Replace the downloadable CV with a website version that omits the phone
number, postcode and referee contact details.

Co-Authored-By: Claude Opus 5.5 <noreply@anthropic.com>
</commit_message>
<xml_diff>
--- a/assets/Alfie_Bunyan_CV.docx
+++ b/assets/Alfie_Bunyan_CV.docx
@@ -439,62 +439,16 @@
           </w:p>
           <w:p>
             <w:pPr>
-              <w:spacing w:after="24" w:before="90" w:line="290" w:lineRule="auto"/>
-            </w:pPr>
-            <w:r>
-              <w:rPr>
-                <w:rFonts w:ascii="Arial" w:cs="Arial" w:eastAsia="Arial" w:hAnsi="Arial"/>
-                <w:b/>
-                <w:bCs/>
-                <w:color w:val="2a2a2a"/>
-                <w:sz w:val="16"/>
-                <w:szCs w:val="16"/>
-              </w:rPr>
-              <w:t xml:space="preserve">Gemma White</w:t>
-            </w:r>
-          </w:p>
-          <w:p>
-            <w:pPr>
-              <w:spacing w:after="50" w:before="0" w:line="290" w:lineRule="auto"/>
-            </w:pPr>
-            <w:r>
-              <w:rPr>
-                <w:rFonts w:ascii="Arial" w:cs="Arial" w:eastAsia="Arial" w:hAnsi="Arial"/>
-                <w:color w:val="555555"/>
-                <w:sz w:val="14"/>
-                <w:szCs w:val="14"/>
-              </w:rPr>
-              <w:t xml:space="preserve">Gemma.white@tottenhamhotspur.com</w:t>
-            </w:r>
-          </w:p>
-          <w:p>
-            <w:pPr>
-              <w:spacing w:after="24" w:before="90" w:line="290" w:lineRule="auto"/>
-            </w:pPr>
-            <w:r>
-              <w:rPr>
-                <w:rFonts w:ascii="Arial" w:cs="Arial" w:eastAsia="Arial" w:hAnsi="Arial"/>
-                <w:b/>
-                <w:bCs/>
-                <w:color w:val="2a2a2a"/>
-                <w:sz w:val="16"/>
-                <w:szCs w:val="16"/>
-              </w:rPr>
-              <w:t xml:space="preserve">Dr. Di Fu (Academic)</w:t>
-            </w:r>
-          </w:p>
-          <w:p>
-            <w:pPr>
-              <w:spacing w:after="50" w:before="0" w:line="290" w:lineRule="auto"/>
-            </w:pPr>
-            <w:r>
-              <w:rPr>
-                <w:rFonts w:ascii="Arial" w:cs="Arial" w:eastAsia="Arial" w:hAnsi="Arial"/>
-                <w:color w:val="555555"/>
-                <w:sz w:val="14"/>
-                <w:szCs w:val="14"/>
-              </w:rPr>
-              <w:t xml:space="preserve">d.fu@surrey.ac.uk</w:t>
+              <w:spacing w:after="30" w:before="0" w:line="290" w:lineRule="auto"/>
+            </w:pPr>
+            <w:r>
+              <w:rPr>
+                <w:rFonts w:ascii="Arial" w:cs="Arial" w:eastAsia="Arial" w:hAnsi="Arial"/>
+                <w:color w:val="3a3a3a"/>
+                <w:sz w:val="16"/>
+                <w:szCs w:val="16"/>
+              </w:rPr>
+              <w:t xml:space="preserve">Available on request</w:t>
             </w:r>
           </w:p>
           <w:p>
@@ -528,16 +482,16 @@
                 <w:sz w:val="16"/>
                 <w:szCs w:val="16"/>
               </w:rPr>
-              <w:t xml:space="preserve">T  </w:t>
-            </w:r>
-            <w:r>
-              <w:rPr>
-                <w:rFonts w:ascii="Arial" w:cs="Arial" w:eastAsia="Arial" w:hAnsi="Arial"/>
-                <w:color w:val="2a2a2a"/>
-                <w:sz w:val="16"/>
-                <w:szCs w:val="16"/>
-              </w:rPr>
-              <w:t xml:space="preserve">+44 7849 522103</w:t>
+              <w:t xml:space="preserve">E  </w:t>
+            </w:r>
+            <w:r>
+              <w:rPr>
+                <w:rFonts w:ascii="Arial" w:cs="Arial" w:eastAsia="Arial" w:hAnsi="Arial"/>
+                <w:color w:val="2a2a2a"/>
+                <w:sz w:val="16"/>
+                <w:szCs w:val="16"/>
+              </w:rPr>
+              <w:t xml:space="preserve">alfiebunyans@gmail.com</w:t>
             </w:r>
           </w:p>
           <w:p>
@@ -551,16 +505,16 @@
                 <w:sz w:val="16"/>
                 <w:szCs w:val="16"/>
               </w:rPr>
-              <w:t xml:space="preserve">E  </w:t>
-            </w:r>
-            <w:r>
-              <w:rPr>
-                <w:rFonts w:ascii="Arial" w:cs="Arial" w:eastAsia="Arial" w:hAnsi="Arial"/>
-                <w:color w:val="2a2a2a"/>
-                <w:sz w:val="16"/>
-                <w:szCs w:val="16"/>
-              </w:rPr>
-              <w:t xml:space="preserve">alfiebunyans@gmail.com</w:t>
+              <w:t xml:space="preserve">L  </w:t>
+            </w:r>
+            <w:r>
+              <w:rPr>
+                <w:rFonts w:ascii="Arial" w:cs="Arial" w:eastAsia="Arial" w:hAnsi="Arial"/>
+                <w:color w:val="2a2a2a"/>
+                <w:sz w:val="16"/>
+                <w:szCs w:val="16"/>
+              </w:rPr>
+              <w:t xml:space="preserve">Guildford, Surrey</w:t>
             </w:r>
           </w:p>
           <w:p>
@@ -574,32 +528,9 @@
                 <w:sz w:val="16"/>
                 <w:szCs w:val="16"/>
               </w:rPr>
-              <w:t xml:space="preserve">L  </w:t>
-            </w:r>
-            <w:r>
-              <w:rPr>
-                <w:rFonts w:ascii="Arial" w:cs="Arial" w:eastAsia="Arial" w:hAnsi="Arial"/>
-                <w:color w:val="2a2a2a"/>
-                <w:sz w:val="16"/>
-                <w:szCs w:val="16"/>
-              </w:rPr>
-              <w:t xml:space="preserve">Guildford, GU1 4XP</w:t>
-            </w:r>
-          </w:p>
-          <w:p>
-            <w:pPr>
-              <w:spacing w:after="60" w:before="0" w:line="290" w:lineRule="auto"/>
-            </w:pPr>
-            <w:r>
-              <w:rPr>
-                <w:rFonts w:ascii="Arial" w:cs="Arial" w:eastAsia="Arial" w:hAnsi="Arial"/>
-                <w:color w:val="555555"/>
-                <w:sz w:val="16"/>
-                <w:szCs w:val="16"/>
-              </w:rPr>
               <w:t xml:space="preserve">in  </w:t>
             </w:r>
-            <w:hyperlink w:history="1" r:id="rIdhpj9mujy9i2oz7ize8ssr">
+            <w:hyperlink w:history="1" r:id="rIdf9usl-0yvrtahk0jhpkta">
               <w:r>
                 <w:rPr>
                   <w:rFonts w:ascii="Arial" w:cs="Arial" w:eastAsia="Arial" w:hAnsi="Arial"/>
@@ -624,7 +555,7 @@
               </w:rPr>
               <w:t xml:space="preserve">W  </w:t>
             </w:r>
-            <w:hyperlink w:history="1" r:id="rIdqhq2dpsyuhi7wm-7wl-gi">
+            <w:hyperlink w:history="1" r:id="rIdipwbpu3mwsslrteyn-pdn">
               <w:r>
                 <w:rPr>
                   <w:rFonts w:ascii="Arial" w:cs="Arial" w:eastAsia="Arial" w:hAnsi="Arial"/>

</xml_diff>